<commit_message>
Rewrite client guide in direct POV
</commit_message>
<xml_diff>
--- a/GUIDEBOOK_CLIENT_SUBDOMAIN.docx
+++ b/GUIDEBOOK_CLIENT_SUBDOMAIN.docx
@@ -2,13 +2,13 @@
 <file path=word/document.xml><?xml version="1.0" encoding="utf-8"?>
 <w:document xmlns:w="http://schemas.openxmlformats.org/wordprocessingml/2006/main" xmlns:m="http://schemas.openxmlformats.org/officeDocument/2006/math" xmlns:r="http://schemas.openxmlformats.org/officeDocument/2006/relationships" xmlns:o="urn:schemas-microsoft-com:office:office" xmlns:v="urn:schemas-microsoft-com:vml" xmlns:w10="urn:schemas-microsoft-com:office:word" xmlns:a="http://schemas.openxmlformats.org/drawingml/2006/main" xmlns:pic="http://schemas.openxmlformats.org/drawingml/2006/picture" xmlns:wp="http://schemas.openxmlformats.org/drawingml/2006/wordprocessingDrawing">
   <w:body>
-    <w:bookmarkStart w:id="35" w:name="X7e1de5a02b89df3480139273b5c32f7f89e8873"/>
+    <w:bookmarkStart w:id="35" w:name="Xca5f9dca96a4373dde35eeca8e3ef128499659b"/>
     <w:p>
       <w:pPr>
         <w:pStyle w:val="Heading1"/>
       </w:pPr>
       <w:r>
-        <w:t xml:space="preserve">Guidebook Setup Project TopUp untuk Client</w:t>
+        <w:t xml:space="preserve">Guidebook Setup Project TopUp di Subdomain Kamu</w:t>
       </w:r>
     </w:p>
     <w:p>
@@ -16,7 +16,7 @@
         <w:pStyle w:val="FirstParagraph"/>
       </w:pPr>
       <w:r>
-        <w:t xml:space="preserve">Dokumen ini adalah panduan instalasi project TopUp di subdomain milik client. Client cukup clone project dari GitHub, menyiapkan database MySQL, mengisi environment production, lalu mendaftarkan callback Hilogate.</w:t>
+        <w:t xml:space="preserve">Dokumen ini menjelaskan cara memasang project TopUp di subdomain kamu. Kamu tinggal clone project dari GitHub, membuat database MySQL, mengisi environment production, lalu mendaftarkan callback Hilogate.</w:t>
       </w:r>
     </w:p>
     <w:p>
@@ -54,7 +54,30 @@
         <w:rPr>
           <w:rStyle w:val="VerbatimChar"/>
         </w:rPr>
-        <w:t xml:space="preserve">https://topup.clientdomain.com</w:t>
+        <w:t xml:space="preserve">https://topup.domainkamu.com</w:t>
+      </w:r>
+    </w:p>
+    <w:p>
+      <w:pPr>
+        <w:pStyle w:val="FirstParagraph"/>
+      </w:pPr>
+      <w:r>
+        <w:t xml:space="preserve">Di semua contoh URL pada dokumen ini, ganti</w:t>
+      </w:r>
+      <w:r>
+        <w:t xml:space="preserve"> </w:t>
+      </w:r>
+      <w:r>
+        <w:rPr>
+          <w:rStyle w:val="VerbatimChar"/>
+        </w:rPr>
+        <w:t xml:space="preserve">topup.domainkamu.com</w:t>
+      </w:r>
+      <w:r>
+        <w:t xml:space="preserve"> </w:t>
+      </w:r>
+      <w:r>
+        <w:t xml:space="preserve">dengan subdomain asli milik kamu.</w:t>
       </w:r>
     </w:p>
     <w:bookmarkStart w:id="20" w:name="gambaran-singkat"/>
@@ -71,12 +94,60 @@
         <w:pStyle w:val="FirstParagraph"/>
       </w:pPr>
       <w:r>
-        <w:t xml:space="preserve">Project TopUp adalah aplikasi Next.js + MySQL untuk registrasi user, login user, request top up QRIS via Hilogate, dan admin panel.</w:t>
-      </w:r>
-    </w:p>
-    <w:p>
-      <w:pPr>
-        <w:pStyle w:val="BodyText"/>
+        <w:t xml:space="preserve">Project TopUp adalah aplikasi Next.js + MySQL untuk:</w:t>
+      </w:r>
+    </w:p>
+    <w:p>
+      <w:pPr>
+        <w:numPr>
+          <w:ilvl w:val="0"/>
+          <w:numId w:val="1001"/>
+        </w:numPr>
+        <w:pStyle w:val="Compact"/>
+      </w:pPr>
+      <w:r>
+        <w:t xml:space="preserve">registrasi user,</w:t>
+      </w:r>
+    </w:p>
+    <w:p>
+      <w:pPr>
+        <w:numPr>
+          <w:ilvl w:val="0"/>
+          <w:numId w:val="1001"/>
+        </w:numPr>
+        <w:pStyle w:val="Compact"/>
+      </w:pPr>
+      <w:r>
+        <w:t xml:space="preserve">login user,</w:t>
+      </w:r>
+    </w:p>
+    <w:p>
+      <w:pPr>
+        <w:numPr>
+          <w:ilvl w:val="0"/>
+          <w:numId w:val="1001"/>
+        </w:numPr>
+        <w:pStyle w:val="Compact"/>
+      </w:pPr>
+      <w:r>
+        <w:t xml:space="preserve">request top up QRIS melalui Hilogate,</w:t>
+      </w:r>
+    </w:p>
+    <w:p>
+      <w:pPr>
+        <w:numPr>
+          <w:ilvl w:val="0"/>
+          <w:numId w:val="1001"/>
+        </w:numPr>
+        <w:pStyle w:val="Compact"/>
+      </w:pPr>
+      <w:r>
+        <w:t xml:space="preserve">admin panel untuk mengelola user, unique ID, dan transaksi top up.</w:t>
+      </w:r>
+    </w:p>
+    <w:p>
+      <w:pPr>
+        <w:pStyle w:val="FirstParagraph"/>
       </w:pPr>
       <w:r>
         <w:t xml:space="preserve">Halaman penting:</w:t>
@@ -108,7 +179,7 @@
               <w:jc w:val="left"/>
             </w:pPr>
             <w:r>
-              <w:t xml:space="preserve">URL di Subdomain</w:t>
+              <w:t xml:space="preserve">URL di Subdomain Kamu</w:t>
             </w:r>
           </w:p>
         </w:tc>
@@ -135,7 +206,7 @@
               <w:rPr>
                 <w:rStyle w:val="VerbatimChar"/>
               </w:rPr>
-              <w:t xml:space="preserve">https://topup.clientdomain.com/register</w:t>
+              <w:t xml:space="preserve">https://topup.domainkamu.com/register</w:t>
             </w:r>
           </w:p>
         </w:tc>
@@ -162,7 +233,7 @@
               <w:rPr>
                 <w:rStyle w:val="VerbatimChar"/>
               </w:rPr>
-              <w:t xml:space="preserve">https://topup.clientdomain.com/login</w:t>
+              <w:t xml:space="preserve">https://topup.domainkamu.com/login</w:t>
             </w:r>
           </w:p>
         </w:tc>
@@ -189,7 +260,7 @@
               <w:rPr>
                 <w:rStyle w:val="VerbatimChar"/>
               </w:rPr>
-              <w:t xml:space="preserve">https://topup.clientdomain.com/topup</w:t>
+              <w:t xml:space="preserve">https://topup.domainkamu.com/topup</w:t>
             </w:r>
           </w:p>
         </w:tc>
@@ -216,7 +287,7 @@
               <w:rPr>
                 <w:rStyle w:val="VerbatimChar"/>
               </w:rPr>
-              <w:t xml:space="preserve">https://topup.clientdomain.com/admin/login</w:t>
+              <w:t xml:space="preserve">https://topup.domainkamu.com/admin/login</w:t>
             </w:r>
           </w:p>
         </w:tc>
@@ -243,7 +314,7 @@
               <w:rPr>
                 <w:rStyle w:val="VerbatimChar"/>
               </w:rPr>
-              <w:t xml:space="preserve">https://topup.clientdomain.com/admin</w:t>
+              <w:t xml:space="preserve">https://topup.domainkamu.com/admin</w:t>
             </w:r>
           </w:p>
         </w:tc>
@@ -254,7 +325,7 @@
         <w:pStyle w:val="BodyText"/>
       </w:pPr>
       <w:r>
-        <w:t xml:space="preserve">Endpoint callback Hilogate:</w:t>
+        <w:t xml:space="preserve">Endpoint callback Hilogate yang nanti kamu daftarkan:</w:t>
       </w:r>
     </w:p>
     <w:p>
@@ -265,7 +336,7 @@
         <w:rPr>
           <w:rStyle w:val="VerbatimChar"/>
         </w:rPr>
-        <w:t xml:space="preserve">https://topup.clientdomain.com/api/callbacks/hilogate/transaction</w:t>
+        <w:t xml:space="preserve">https://topup.domainkamu.com/api/callbacks/hilogate/transaction</w:t>
       </w:r>
       <w:r>
         <w:br/>
@@ -274,17 +345,17 @@
         <w:rPr>
           <w:rStyle w:val="VerbatimChar"/>
         </w:rPr>
-        <w:t xml:space="preserve">https://topup.clientdomain.com/api/callbacks/hilogate/withdrawal</w:t>
+        <w:t xml:space="preserve">https://topup.domainkamu.com/api/callbacks/hilogate/withdrawal</w:t>
       </w:r>
     </w:p>
     <w:bookmarkEnd w:id="20"/>
-    <w:bookmarkStart w:id="21" w:name="data-yang-harus-disiapkan-client"/>
+    <w:bookmarkStart w:id="21" w:name="yang-harus-kamu-siapkan"/>
     <w:p>
       <w:pPr>
         <w:pStyle w:val="Heading2"/>
       </w:pPr>
       <w:r>
-        <w:t xml:space="preserve">2. Data yang Harus Disiapkan Client</w:t>
+        <w:t xml:space="preserve">2. Yang Harus Kamu Siapkan</w:t>
       </w:r>
     </w:p>
     <w:p>
@@ -292,14 +363,14 @@
         <w:pStyle w:val="FirstParagraph"/>
       </w:pPr>
       <w:r>
-        <w:t xml:space="preserve">Sebelum setup, client perlu menyiapkan:</w:t>
-      </w:r>
-    </w:p>
-    <w:p>
-      <w:pPr>
-        <w:numPr>
-          <w:ilvl w:val="0"/>
-          <w:numId w:val="1001"/>
+        <w:t xml:space="preserve">Sebelum mulai setup, siapkan data berikut:</w:t>
+      </w:r>
+    </w:p>
+    <w:p>
+      <w:pPr>
+        <w:numPr>
+          <w:ilvl w:val="0"/>
+          <w:numId w:val="1002"/>
         </w:numPr>
         <w:pStyle w:val="Compact"/>
       </w:pPr>
@@ -313,7 +384,7 @@
         <w:rPr>
           <w:rStyle w:val="VerbatimChar"/>
         </w:rPr>
-        <w:t xml:space="preserve">https://topup.clientdomain.com</w:t>
+        <w:t xml:space="preserve">https://topup.domainkamu.com</w:t>
       </w:r>
       <w:r>
         <w:t xml:space="preserve">.</w:t>
@@ -323,7 +394,7 @@
       <w:pPr>
         <w:numPr>
           <w:ilvl w:val="0"/>
-          <w:numId w:val="1001"/>
+          <w:numId w:val="1002"/>
         </w:numPr>
         <w:pStyle w:val="Compact"/>
       </w:pPr>
@@ -335,7 +406,7 @@
       <w:pPr>
         <w:numPr>
           <w:ilvl w:val="0"/>
-          <w:numId w:val="1001"/>
+          <w:numId w:val="1002"/>
         </w:numPr>
         <w:pStyle w:val="Compact"/>
       </w:pPr>
@@ -347,84 +418,12 @@
       <w:pPr>
         <w:numPr>
           <w:ilvl w:val="0"/>
-          <w:numId w:val="1001"/>
+          <w:numId w:val="1002"/>
         </w:numPr>
         <w:pStyle w:val="Compact"/>
       </w:pPr>
       <w:r>
         <w:t xml:space="preserve">Credential database:</w:t>
-      </w:r>
-    </w:p>
-    <w:p>
-      <w:pPr>
-        <w:numPr>
-          <w:ilvl w:val="1"/>
-          <w:numId w:val="1002"/>
-        </w:numPr>
-        <w:pStyle w:val="Compact"/>
-      </w:pPr>
-      <w:r>
-        <w:t xml:space="preserve">host</w:t>
-      </w:r>
-    </w:p>
-    <w:p>
-      <w:pPr>
-        <w:numPr>
-          <w:ilvl w:val="1"/>
-          <w:numId w:val="1002"/>
-        </w:numPr>
-        <w:pStyle w:val="Compact"/>
-      </w:pPr>
-      <w:r>
-        <w:t xml:space="preserve">port</w:t>
-      </w:r>
-    </w:p>
-    <w:p>
-      <w:pPr>
-        <w:numPr>
-          <w:ilvl w:val="1"/>
-          <w:numId w:val="1002"/>
-        </w:numPr>
-        <w:pStyle w:val="Compact"/>
-      </w:pPr>
-      <w:r>
-        <w:t xml:space="preserve">database name</w:t>
-      </w:r>
-    </w:p>
-    <w:p>
-      <w:pPr>
-        <w:numPr>
-          <w:ilvl w:val="1"/>
-          <w:numId w:val="1002"/>
-        </w:numPr>
-        <w:pStyle w:val="Compact"/>
-      </w:pPr>
-      <w:r>
-        <w:t xml:space="preserve">username</w:t>
-      </w:r>
-    </w:p>
-    <w:p>
-      <w:pPr>
-        <w:numPr>
-          <w:ilvl w:val="1"/>
-          <w:numId w:val="1002"/>
-        </w:numPr>
-        <w:pStyle w:val="Compact"/>
-      </w:pPr>
-      <w:r>
-        <w:t xml:space="preserve">password</w:t>
-      </w:r>
-    </w:p>
-    <w:p>
-      <w:pPr>
-        <w:numPr>
-          <w:ilvl w:val="0"/>
-          <w:numId w:val="1001"/>
-        </w:numPr>
-        <w:pStyle w:val="Compact"/>
-      </w:pPr>
-      <w:r>
-        <w:t xml:space="preserve">Credential Hilogate:</w:t>
       </w:r>
     </w:p>
     <w:p>
@@ -436,7 +435,7 @@
         <w:pStyle w:val="Compact"/>
       </w:pPr>
       <w:r>
-        <w:t xml:space="preserve">Merchant ID</w:t>
+        <w:t xml:space="preserve">host,</w:t>
       </w:r>
     </w:p>
     <w:p>
@@ -448,19 +447,91 @@
         <w:pStyle w:val="Compact"/>
       </w:pPr>
       <w:r>
-        <w:t xml:space="preserve">Secret Key</w:t>
-      </w:r>
-    </w:p>
-    <w:p>
-      <w:pPr>
-        <w:numPr>
-          <w:ilvl w:val="0"/>
-          <w:numId w:val="1001"/>
-        </w:numPr>
-        <w:pStyle w:val="Compact"/>
-      </w:pPr>
-      <w:r>
-        <w:t xml:space="preserve">Email dan password admin awal.</w:t>
+        <w:t xml:space="preserve">port,</w:t>
+      </w:r>
+    </w:p>
+    <w:p>
+      <w:pPr>
+        <w:numPr>
+          <w:ilvl w:val="1"/>
+          <w:numId w:val="1003"/>
+        </w:numPr>
+        <w:pStyle w:val="Compact"/>
+      </w:pPr>
+      <w:r>
+        <w:t xml:space="preserve">database name,</w:t>
+      </w:r>
+    </w:p>
+    <w:p>
+      <w:pPr>
+        <w:numPr>
+          <w:ilvl w:val="1"/>
+          <w:numId w:val="1003"/>
+        </w:numPr>
+        <w:pStyle w:val="Compact"/>
+      </w:pPr>
+      <w:r>
+        <w:t xml:space="preserve">username,</w:t>
+      </w:r>
+    </w:p>
+    <w:p>
+      <w:pPr>
+        <w:numPr>
+          <w:ilvl w:val="1"/>
+          <w:numId w:val="1003"/>
+        </w:numPr>
+        <w:pStyle w:val="Compact"/>
+      </w:pPr>
+      <w:r>
+        <w:t xml:space="preserve">password.</w:t>
+      </w:r>
+    </w:p>
+    <w:p>
+      <w:pPr>
+        <w:numPr>
+          <w:ilvl w:val="0"/>
+          <w:numId w:val="1002"/>
+        </w:numPr>
+        <w:pStyle w:val="Compact"/>
+      </w:pPr>
+      <w:r>
+        <w:t xml:space="preserve">Credential Hilogate:</w:t>
+      </w:r>
+    </w:p>
+    <w:p>
+      <w:pPr>
+        <w:numPr>
+          <w:ilvl w:val="1"/>
+          <w:numId w:val="1004"/>
+        </w:numPr>
+        <w:pStyle w:val="Compact"/>
+      </w:pPr>
+      <w:r>
+        <w:t xml:space="preserve">Merchant ID,</w:t>
+      </w:r>
+    </w:p>
+    <w:p>
+      <w:pPr>
+        <w:numPr>
+          <w:ilvl w:val="1"/>
+          <w:numId w:val="1004"/>
+        </w:numPr>
+        <w:pStyle w:val="Compact"/>
+      </w:pPr>
+      <w:r>
+        <w:t xml:space="preserve">Secret Key.</w:t>
+      </w:r>
+    </w:p>
+    <w:p>
+      <w:pPr>
+        <w:numPr>
+          <w:ilvl w:val="0"/>
+          <w:numId w:val="1002"/>
+        </w:numPr>
+        <w:pStyle w:val="Compact"/>
+      </w:pPr>
+      <w:r>
+        <w:t xml:space="preserve">Email dan password untuk admin pertama.</w:t>
       </w:r>
     </w:p>
     <w:bookmarkEnd w:id="21"/>
@@ -478,7 +549,7 @@
         <w:pStyle w:val="FirstParagraph"/>
       </w:pPr>
       <w:r>
-        <w:t xml:space="preserve">Jalankan command berikut di server atau local environment:</w:t>
+        <w:t xml:space="preserve">Masuk ke server atau local environment kamu, lalu jalankan:</w:t>
       </w:r>
     </w:p>
     <w:p>
@@ -533,7 +604,7 @@
         <w:pStyle w:val="FirstParagraph"/>
       </w:pPr>
       <w:r>
-        <w:t xml:space="preserve">Test build:</w:t>
+        <w:t xml:space="preserve">Untuk memastikan project bisa di-build:</w:t>
       </w:r>
     </w:p>
     <w:p>
@@ -558,7 +629,7 @@
         <w:pStyle w:val="FirstParagraph"/>
       </w:pPr>
       <w:r>
-        <w:t xml:space="preserve">Untuk menjalankan local:</w:t>
+        <w:t xml:space="preserve">Untuk menjalankan project di local:</w:t>
       </w:r>
     </w:p>
     <w:p>
@@ -612,7 +683,7 @@
         <w:pStyle w:val="FirstParagraph"/>
       </w:pPr>
       <w:r>
-        <w:t xml:space="preserve">Buat database baru:</w:t>
+        <w:t xml:space="preserve">Buat database baru di MySQL kamu:</w:t>
       </w:r>
     </w:p>
     <w:p>
@@ -673,7 +744,19 @@
         <w:pStyle w:val="FirstParagraph"/>
       </w:pPr>
       <w:r>
-        <w:t xml:space="preserve">Import schema:</w:t>
+        <w:t xml:space="preserve">Import struktur tabel dari file</w:t>
+      </w:r>
+      <w:r>
+        <w:t xml:space="preserve"> </w:t>
+      </w:r>
+      <w:r>
+        <w:rPr>
+          <w:rStyle w:val="VerbatimChar"/>
+        </w:rPr>
+        <w:t xml:space="preserve">schema.sql</w:t>
+      </w:r>
+      <w:r>
+        <w:t xml:space="preserve">:</w:t>
       </w:r>
     </w:p>
     <w:p>
@@ -746,7 +829,7 @@
         <w:pStyle w:val="FirstParagraph"/>
       </w:pPr>
       <w:r>
-        <w:t xml:space="preserve">Jika database berasal dari versi lama project, jalankan migration tambahan:</w:t>
+        <w:t xml:space="preserve">Jika kamu pernah memakai versi lama project ini, jalankan migration Hilogate:</w:t>
       </w:r>
     </w:p>
     <w:p>
@@ -1031,7 +1114,7 @@
         <w:pStyle w:val="FirstParagraph"/>
       </w:pPr>
       <w:r>
-        <w:t xml:space="preserve">Di hosting, isi Environment Variables berikut. Jika testing local, buat file</w:t>
+        <w:t xml:space="preserve">Di hosting kamu, isi Environment Variables berikut. Jika kamu testing di local, buat file</w:t>
       </w:r>
       <w:r>
         <w:t xml:space="preserve"> </w:t>
@@ -1054,7 +1137,7 @@
         <w:rPr>
           <w:rStyle w:val="VerbatimChar"/>
         </w:rPr>
-        <w:t xml:space="preserve">DB_HOST=isi_host_database_client</w:t>
+        <w:t xml:space="preserve">DB_HOST=isi_host_database_kamu</w:t>
       </w:r>
       <w:r>
         <w:br/>
@@ -1072,7 +1155,7 @@
         <w:rPr>
           <w:rStyle w:val="VerbatimChar"/>
         </w:rPr>
-        <w:t xml:space="preserve">DB_USER=isi_user_database_client</w:t>
+        <w:t xml:space="preserve">DB_USER=isi_user_database_kamu</w:t>
       </w:r>
       <w:r>
         <w:br/>
@@ -1081,7 +1164,7 @@
         <w:rPr>
           <w:rStyle w:val="VerbatimChar"/>
         </w:rPr>
-        <w:t xml:space="preserve">DB_PASSWORD=isi_password_database_client</w:t>
+        <w:t xml:space="preserve">DB_PASSWORD=isi_password_database_kamu</w:t>
       </w:r>
       <w:r>
         <w:br/>
@@ -1132,7 +1215,7 @@
         <w:rPr>
           <w:rStyle w:val="VerbatimChar"/>
         </w:rPr>
-        <w:t xml:space="preserve">HILOGATE_MERCHANT_ID=isi_merchant_id_hilogate</w:t>
+        <w:t xml:space="preserve">HILOGATE_MERCHANT_ID=isi_merchant_id_hilogate_kamu</w:t>
       </w:r>
       <w:r>
         <w:br/>
@@ -1141,7 +1224,7 @@
         <w:rPr>
           <w:rStyle w:val="VerbatimChar"/>
         </w:rPr>
-        <w:t xml:space="preserve">HILOGATE_SECRET_KEY=isi_secret_key_hilogate</w:t>
+        <w:t xml:space="preserve">HILOGATE_SECRET_KEY=isi_secret_key_hilogate_kamu</w:t>
       </w:r>
       <w:r>
         <w:br/>
@@ -1165,7 +1248,7 @@
       <w:pPr>
         <w:numPr>
           <w:ilvl w:val="0"/>
-          <w:numId w:val="1004"/>
+          <w:numId w:val="1005"/>
         </w:numPr>
         <w:pStyle w:val="Compact"/>
       </w:pPr>
@@ -1192,7 +1275,7 @@
       <w:pPr>
         <w:numPr>
           <w:ilvl w:val="0"/>
-          <w:numId w:val="1004"/>
+          <w:numId w:val="1005"/>
         </w:numPr>
         <w:pStyle w:val="Compact"/>
       </w:pPr>
@@ -1228,36 +1311,21 @@
       <w:pPr>
         <w:numPr>
           <w:ilvl w:val="0"/>
-          <w:numId w:val="1004"/>
-        </w:numPr>
-        <w:pStyle w:val="Compact"/>
-      </w:pPr>
-      <w:r>
-        <w:t xml:space="preserve">Untuk production,</w:t>
-      </w:r>
-      <w:r>
-        <w:t xml:space="preserve"> </w:t>
-      </w:r>
-      <w:r>
-        <w:rPr>
-          <w:rStyle w:val="VerbatimChar"/>
-        </w:rPr>
-        <w:t xml:space="preserve">HILOGATE_ENVIRONMENT</w:t>
-      </w:r>
-      <w:r>
-        <w:t xml:space="preserve"> </w:t>
-      </w:r>
-      <w:r>
-        <w:t xml:space="preserve">harus</w:t>
-      </w:r>
-      <w:r>
-        <w:t xml:space="preserve"> </w:t>
-      </w:r>
-      <w:r>
-        <w:rPr>
-          <w:rStyle w:val="VerbatimChar"/>
-        </w:rPr>
-        <w:t xml:space="preserve">live</w:t>
+          <w:numId w:val="1005"/>
+        </w:numPr>
+        <w:pStyle w:val="Compact"/>
+      </w:pPr>
+      <w:r>
+        <w:t xml:space="preserve">Untuk production, isi</w:t>
+      </w:r>
+      <w:r>
+        <w:t xml:space="preserve"> </w:t>
+      </w:r>
+      <w:r>
+        <w:rPr>
+          <w:rStyle w:val="VerbatimChar"/>
+        </w:rPr>
+        <w:t xml:space="preserve">HILOGATE_ENVIRONMENT=live</w:t>
       </w:r>
       <w:r>
         <w:t xml:space="preserve">.</w:t>
@@ -1267,12 +1335,12 @@
       <w:pPr>
         <w:numPr>
           <w:ilvl w:val="0"/>
-          <w:numId w:val="1004"/>
-        </w:numPr>
-        <w:pStyle w:val="Compact"/>
-      </w:pPr>
-      <w:r>
-        <w:t xml:space="preserve">Karena setup memakai subdomain, tidak perlu mengisi</w:t>
+          <w:numId w:val="1005"/>
+        </w:numPr>
+        <w:pStyle w:val="Compact"/>
+      </w:pPr>
+      <w:r>
+        <w:t xml:space="preserve">Karena setup ini memakai subdomain, kamu tidak perlu mengisi</w:t>
       </w:r>
       <w:r>
         <w:t xml:space="preserve"> </w:t>
@@ -1317,7 +1385,7 @@
         <w:pStyle w:val="FirstParagraph"/>
       </w:pPr>
       <w:r>
-        <w:t xml:space="preserve">Client perlu membuat subdomain, contoh:</w:t>
+        <w:t xml:space="preserve">Buat subdomain untuk aplikasi TopUp, contoh:</w:t>
       </w:r>
     </w:p>
     <w:p>
@@ -1328,7 +1396,7 @@
         <w:rPr>
           <w:rStyle w:val="VerbatimChar"/>
         </w:rPr>
-        <w:t xml:space="preserve">topup.clientdomain.com</w:t>
+        <w:t xml:space="preserve">topup.domainkamu.com</w:t>
       </w:r>
     </w:p>
     <w:p>
@@ -1336,7 +1404,7 @@
         <w:pStyle w:val="FirstParagraph"/>
       </w:pPr>
       <w:r>
-        <w:t xml:space="preserve">Arahkan DNS subdomain tersebut ke hosting aplikasi sesuai instruksi provider hosting.</w:t>
+        <w:t xml:space="preserve">Setelah itu, arahkan DNS subdomain tersebut ke hosting aplikasi kamu sesuai instruksi provider hosting.</w:t>
       </w:r>
     </w:p>
     <w:p>
@@ -1344,7 +1412,7 @@
         <w:pStyle w:val="BodyText"/>
       </w:pPr>
       <w:r>
-        <w:t xml:space="preserve">Setelah deploy berhasil, pastikan URL berikut bisa dibuka:</w:t>
+        <w:t xml:space="preserve">Setelah deploy berhasil, pastikan URL ini bisa dibuka:</w:t>
       </w:r>
     </w:p>
     <w:p>
@@ -1355,7 +1423,7 @@
         <w:rPr>
           <w:rStyle w:val="VerbatimChar"/>
         </w:rPr>
-        <w:t xml:space="preserve">https://topup.clientdomain.com/login</w:t>
+        <w:t xml:space="preserve">https://topup.domainkamu.com/login</w:t>
       </w:r>
       <w:r>
         <w:br/>
@@ -1364,7 +1432,7 @@
         <w:rPr>
           <w:rStyle w:val="VerbatimChar"/>
         </w:rPr>
-        <w:t xml:space="preserve">https://topup.clientdomain.com/register</w:t>
+        <w:t xml:space="preserve">https://topup.domainkamu.com/register</w:t>
       </w:r>
       <w:r>
         <w:br/>
@@ -1373,17 +1441,17 @@
         <w:rPr>
           <w:rStyle w:val="VerbatimChar"/>
         </w:rPr>
-        <w:t xml:space="preserve">https://topup.clientdomain.com/admin/login</w:t>
+        <w:t xml:space="preserve">https://topup.domainkamu.com/admin/login</w:t>
       </w:r>
     </w:p>
     <w:bookmarkEnd w:id="25"/>
-    <w:bookmarkStart w:id="26" w:name="hubungkan-dari-website-utama-client"/>
+    <w:bookmarkStart w:id="26" w:name="hubungkan-dari-website-utama-kamu"/>
     <w:p>
       <w:pPr>
         <w:pStyle w:val="Heading2"/>
       </w:pPr>
       <w:r>
-        <w:t xml:space="preserve">7. Hubungkan dari Website Utama Client</w:t>
+        <w:t xml:space="preserve">7. Hubungkan dari Website Utama Kamu</w:t>
       </w:r>
     </w:p>
     <w:p>
@@ -1391,7 +1459,7 @@
         <w:pStyle w:val="FirstParagraph"/>
       </w:pPr>
       <w:r>
-        <w:t xml:space="preserve">Di website utama client, tambahkan tombol menuju halaman register TopUp.</w:t>
+        <w:t xml:space="preserve">Di website utama kamu, tambahkan tombol menuju halaman register TopUp.</w:t>
       </w:r>
     </w:p>
     <w:p>
@@ -1399,7 +1467,7 @@
         <w:pStyle w:val="BodyText"/>
       </w:pPr>
       <w:r>
-        <w:t xml:space="preserve">Contoh:</w:t>
+        <w:t xml:space="preserve">Contoh tombol register:</w:t>
       </w:r>
     </w:p>
     <w:p>
@@ -1422,7 +1490,7 @@
         <w:rPr>
           <w:rStyle w:val="StringTok"/>
         </w:rPr>
-        <w:t xml:space="preserve">"https://topup.clientdomain.com/register"</w:t>
+        <w:t xml:space="preserve">"https://topup.domainkamu.com/register"</w:t>
       </w:r>
       <w:r>
         <w:rPr>
@@ -1448,7 +1516,7 @@
         <w:pStyle w:val="FirstParagraph"/>
       </w:pPr>
       <w:r>
-        <w:t xml:space="preserve">Jika client ingin user lama langsung login:</w:t>
+        <w:t xml:space="preserve">Jika kamu ingin user lama langsung masuk ke halaman login:</w:t>
       </w:r>
     </w:p>
     <w:p>
@@ -1471,7 +1539,7 @@
         <w:rPr>
           <w:rStyle w:val="StringTok"/>
         </w:rPr>
-        <w:t xml:space="preserve">"https://topup.clientdomain.com/login"</w:t>
+        <w:t xml:space="preserve">"https://topup.domainkamu.com/login"</w:t>
       </w:r>
       <w:r>
         <w:rPr>
@@ -1504,7 +1572,7 @@
       <w:pPr>
         <w:numPr>
           <w:ilvl w:val="0"/>
-          <w:numId w:val="1005"/>
+          <w:numId w:val="1006"/>
         </w:numPr>
         <w:pStyle w:val="Compact"/>
       </w:pPr>
@@ -1527,14 +1595,14 @@
         <w:t xml:space="preserve"> </w:t>
       </w:r>
       <w:r>
-        <w:t xml:space="preserve">di website utama client.</w:t>
-      </w:r>
-    </w:p>
-    <w:p>
-      <w:pPr>
-        <w:numPr>
-          <w:ilvl w:val="0"/>
-          <w:numId w:val="1005"/>
+        <w:t xml:space="preserve">di website utama kamu.</w:t>
+      </w:r>
+    </w:p>
+    <w:p>
+      <w:pPr>
+        <w:numPr>
+          <w:ilvl w:val="0"/>
+          <w:numId w:val="1006"/>
         </w:numPr>
         <w:pStyle w:val="Compact"/>
       </w:pPr>
@@ -1548,7 +1616,7 @@
         <w:rPr>
           <w:rStyle w:val="VerbatimChar"/>
         </w:rPr>
-        <w:t xml:space="preserve">https://topup.clientdomain.com/register</w:t>
+        <w:t xml:space="preserve">https://topup.domainkamu.com/register</w:t>
       </w:r>
       <w:r>
         <w:t xml:space="preserve">.</w:t>
@@ -1558,7 +1626,7 @@
       <w:pPr>
         <w:numPr>
           <w:ilvl w:val="0"/>
-          <w:numId w:val="1005"/>
+          <w:numId w:val="1006"/>
         </w:numPr>
         <w:pStyle w:val="Compact"/>
       </w:pPr>
@@ -1582,7 +1650,7 @@
       <w:pPr>
         <w:numPr>
           <w:ilvl w:val="0"/>
-          <w:numId w:val="1005"/>
+          <w:numId w:val="1006"/>
         </w:numPr>
         <w:pStyle w:val="Compact"/>
       </w:pPr>
@@ -1594,7 +1662,7 @@
       <w:pPr>
         <w:numPr>
           <w:ilvl w:val="0"/>
-          <w:numId w:val="1005"/>
+          <w:numId w:val="1006"/>
         </w:numPr>
         <w:pStyle w:val="Compact"/>
       </w:pPr>
@@ -1629,7 +1697,7 @@
         <w:pStyle w:val="FirstParagraph"/>
       </w:pPr>
       <w:r>
-        <w:t xml:space="preserve">Minta client mendaftarkan callback berikut di dashboard Hilogate:</w:t>
+        <w:t xml:space="preserve">Di dashboard Hilogate kamu, masukkan callback berikut:</w:t>
       </w:r>
     </w:p>
     <w:p>
@@ -1640,7 +1708,7 @@
         <w:rPr>
           <w:rStyle w:val="VerbatimChar"/>
         </w:rPr>
-        <w:t xml:space="preserve">https://topup.clientdomain.com/api/callbacks/hilogate/transaction</w:t>
+        <w:t xml:space="preserve">https://topup.domainkamu.com/api/callbacks/hilogate/transaction</w:t>
       </w:r>
       <w:r>
         <w:br/>
@@ -1649,7 +1717,7 @@
         <w:rPr>
           <w:rStyle w:val="VerbatimChar"/>
         </w:rPr>
-        <w:t xml:space="preserve">https://topup.clientdomain.com/api/callbacks/hilogate/withdrawal</w:t>
+        <w:t xml:space="preserve">https://topup.domainkamu.com/api/callbacks/hilogate/withdrawal</w:t>
       </w:r>
     </w:p>
     <w:p>
@@ -1657,7 +1725,7 @@
         <w:pStyle w:val="FirstParagraph"/>
       </w:pPr>
       <w:r>
-        <w:t xml:space="preserve">Data yang perlu dikirim ke Hilogate:</w:t>
+        <w:t xml:space="preserve">Data yang kamu isi di Hilogate:</w:t>
       </w:r>
     </w:p>
     <w:tbl>
@@ -1716,7 +1784,7 @@
               <w:rPr>
                 <w:rStyle w:val="VerbatimChar"/>
               </w:rPr>
-              <w:t xml:space="preserve">https://topup.clientdomain.com/api/callbacks/hilogate/transaction</w:t>
+              <w:t xml:space="preserve">https://topup.domainkamu.com/api/callbacks/hilogate/transaction</w:t>
             </w:r>
           </w:p>
         </w:tc>
@@ -1743,7 +1811,7 @@
               <w:rPr>
                 <w:rStyle w:val="VerbatimChar"/>
               </w:rPr>
-              <w:t xml:space="preserve">https://topup.clientdomain.com/api/callbacks/hilogate/withdrawal</w:t>
+              <w:t xml:space="preserve">https://topup.domainkamu.com/api/callbacks/hilogate/withdrawal</w:t>
             </w:r>
           </w:p>
         </w:tc>
@@ -1781,7 +1849,7 @@
         <w:pStyle w:val="BodyText"/>
       </w:pPr>
       <w:r>
-        <w:t xml:space="preserve">Setelah callback aktif, Hilogate akan mengirim update status transaksi ke aplikasi. Aplikasi akan menyimpan status tersebut ke tabel</w:t>
+        <w:t xml:space="preserve">Setelah callback aktif, Hilogate akan mengirim update status transaksi ke aplikasi TopUp kamu. Aplikasi akan menyimpan status tersebut ke tabel</w:t>
       </w:r>
       <w:r>
         <w:t xml:space="preserve"> </w:t>
@@ -1797,13 +1865,13 @@
       </w:r>
     </w:p>
     <w:bookmarkEnd w:id="27"/>
-    <w:bookmarkStart w:id="28" w:name="buat-akun-admin-awal"/>
+    <w:bookmarkStart w:id="28" w:name="buat-akun-admin-pertama"/>
     <w:p>
       <w:pPr>
         <w:pStyle w:val="Heading2"/>
       </w:pPr>
       <w:r>
-        <w:t xml:space="preserve">9. Buat Akun Admin Awal</w:t>
+        <w:t xml:space="preserve">9. Buat Akun Admin Pertama</w:t>
       </w:r>
     </w:p>
     <w:p>
@@ -1842,7 +1910,7 @@
         <w:rPr>
           <w:rStyle w:val="NormalTok"/>
         </w:rPr>
-        <w:t xml:space="preserve">admin@clientdomain.com </w:t>
+        <w:t xml:space="preserve">admin@domainkamu.com </w:t>
       </w:r>
       <w:r>
         <w:rPr>
@@ -1915,7 +1983,7 @@
         <w:rPr>
           <w:rStyle w:val="NormalTok"/>
         </w:rPr>
-        <w:t xml:space="preserve">'admin@clientdomain</w:t>
+        <w:t xml:space="preserve">'admin@domainkamu</w:t>
       </w:r>
       <w:r>
         <w:rPr>
@@ -1995,7 +2063,7 @@
         <w:pStyle w:val="FirstParagraph"/>
       </w:pPr>
       <w:r>
-        <w:t xml:space="preserve">Login admin:</w:t>
+        <w:t xml:space="preserve">Setelah berhasil, login admin lewat:</w:t>
       </w:r>
     </w:p>
     <w:p>
@@ -2006,7 +2074,7 @@
         <w:rPr>
           <w:rStyle w:val="VerbatimChar"/>
         </w:rPr>
-        <w:t xml:space="preserve">https://topup.clientdomain.com/admin/login</w:t>
+        <w:t xml:space="preserve">https://topup.domainkamu.com/admin/login</w:t>
       </w:r>
     </w:p>
     <w:bookmarkEnd w:id="28"/>
@@ -2024,7 +2092,7 @@
         <w:pStyle w:val="FirstParagraph"/>
       </w:pPr>
       <w:r>
-        <w:t xml:space="preserve">User hanya bisa register jika admin sudah menyiapkan</w:t>
+        <w:t xml:space="preserve">User hanya bisa register jika kamu sudah menyiapkan</w:t>
       </w:r>
       <w:r>
         <w:t xml:space="preserve"> </w:t>
@@ -2036,85 +2104,88 @@
         <w:t xml:space="preserve">unique_id</w:t>
       </w:r>
       <w:r>
+        <w:t xml:space="preserve"> </w:t>
+      </w:r>
+      <w:r>
+        <w:t xml:space="preserve">dari admin panel.</w:t>
+      </w:r>
+    </w:p>
+    <w:p>
+      <w:pPr>
+        <w:pStyle w:val="BodyText"/>
+      </w:pPr>
+      <w:r>
+        <w:t xml:space="preserve">Langkah:</w:t>
+      </w:r>
+    </w:p>
+    <w:p>
+      <w:pPr>
+        <w:numPr>
+          <w:ilvl w:val="0"/>
+          <w:numId w:val="1007"/>
+        </w:numPr>
+        <w:pStyle w:val="Compact"/>
+      </w:pPr>
+      <w:r>
+        <w:t xml:space="preserve">Login ke admin panel.</w:t>
+      </w:r>
+    </w:p>
+    <w:p>
+      <w:pPr>
+        <w:numPr>
+          <w:ilvl w:val="0"/>
+          <w:numId w:val="1007"/>
+        </w:numPr>
+        <w:pStyle w:val="Compact"/>
+      </w:pPr>
+      <w:r>
+        <w:t xml:space="preserve">Buka menu Unique ID atau Data User.</w:t>
+      </w:r>
+    </w:p>
+    <w:p>
+      <w:pPr>
+        <w:numPr>
+          <w:ilvl w:val="0"/>
+          <w:numId w:val="1007"/>
+        </w:numPr>
+        <w:pStyle w:val="Compact"/>
+      </w:pPr>
+      <w:r>
+        <w:t xml:space="preserve">Tambahkan</w:t>
+      </w:r>
+      <w:r>
+        <w:t xml:space="preserve"> </w:t>
+      </w:r>
+      <w:r>
+        <w:rPr>
+          <w:rStyle w:val="VerbatimChar"/>
+        </w:rPr>
+        <w:t xml:space="preserve">unique_id</w:t>
+      </w:r>
+      <w:r>
+        <w:t xml:space="preserve"> </w:t>
+      </w:r>
+      <w:r>
+        <w:t xml:space="preserve">secara manual, atau import file Excel</w:t>
+      </w:r>
+      <w:r>
+        <w:t xml:space="preserve"> </w:t>
+      </w:r>
+      <w:r>
+        <w:rPr>
+          <w:rStyle w:val="VerbatimChar"/>
+        </w:rPr>
+        <w:t xml:space="preserve">.xlsx/.xls</w:t>
+      </w:r>
+      <w:r>
         <w:t xml:space="preserve">.</w:t>
       </w:r>
     </w:p>
     <w:p>
       <w:pPr>
-        <w:pStyle w:val="BodyText"/>
-      </w:pPr>
-      <w:r>
-        <w:t xml:space="preserve">Langkah:</w:t>
-      </w:r>
-    </w:p>
-    <w:p>
-      <w:pPr>
-        <w:numPr>
-          <w:ilvl w:val="0"/>
-          <w:numId w:val="1006"/>
-        </w:numPr>
-        <w:pStyle w:val="Compact"/>
-      </w:pPr>
-      <w:r>
-        <w:t xml:space="preserve">Login ke admin panel.</w:t>
-      </w:r>
-    </w:p>
-    <w:p>
-      <w:pPr>
-        <w:numPr>
-          <w:ilvl w:val="0"/>
-          <w:numId w:val="1006"/>
-        </w:numPr>
-        <w:pStyle w:val="Compact"/>
-      </w:pPr>
-      <w:r>
-        <w:t xml:space="preserve">Buka menu Unique ID atau Data User.</w:t>
-      </w:r>
-    </w:p>
-    <w:p>
-      <w:pPr>
-        <w:numPr>
-          <w:ilvl w:val="0"/>
-          <w:numId w:val="1006"/>
-        </w:numPr>
-        <w:pStyle w:val="Compact"/>
-      </w:pPr>
-      <w:r>
-        <w:t xml:space="preserve">Tambahkan</w:t>
-      </w:r>
-      <w:r>
-        <w:t xml:space="preserve"> </w:t>
-      </w:r>
-      <w:r>
-        <w:rPr>
-          <w:rStyle w:val="VerbatimChar"/>
-        </w:rPr>
-        <w:t xml:space="preserve">unique_id</w:t>
-      </w:r>
-      <w:r>
-        <w:t xml:space="preserve"> </w:t>
-      </w:r>
-      <w:r>
-        <w:t xml:space="preserve">manual, atau import file Excel</w:t>
-      </w:r>
-      <w:r>
-        <w:t xml:space="preserve"> </w:t>
-      </w:r>
-      <w:r>
-        <w:rPr>
-          <w:rStyle w:val="VerbatimChar"/>
-        </w:rPr>
-        <w:t xml:space="preserve">.xlsx/.xls</w:t>
-      </w:r>
-      <w:r>
-        <w:t xml:space="preserve">.</w:t>
-      </w:r>
-    </w:p>
-    <w:p>
-      <w:pPr>
-        <w:numPr>
-          <w:ilvl w:val="0"/>
-          <w:numId w:val="1006"/>
+        <w:numPr>
+          <w:ilvl w:val="0"/>
+          <w:numId w:val="1007"/>
         </w:numPr>
         <w:pStyle w:val="Compact"/>
       </w:pPr>
@@ -2145,14 +2216,14 @@
         <w:pStyle w:val="FirstParagraph"/>
       </w:pPr>
       <w:r>
-        <w:t xml:space="preserve">Alur deployment:</w:t>
-      </w:r>
-    </w:p>
-    <w:p>
-      <w:pPr>
-        <w:numPr>
-          <w:ilvl w:val="0"/>
-          <w:numId w:val="1007"/>
+        <w:t xml:space="preserve">Urutan deployment:</w:t>
+      </w:r>
+    </w:p>
+    <w:p>
+      <w:pPr>
+        <w:numPr>
+          <w:ilvl w:val="0"/>
+          <w:numId w:val="1008"/>
         </w:numPr>
         <w:pStyle w:val="Compact"/>
       </w:pPr>
@@ -2196,7 +2267,7 @@
       <w:pPr>
         <w:numPr>
           <w:ilvl w:val="0"/>
-          <w:numId w:val="1008"/>
+          <w:numId w:val="1009"/>
         </w:numPr>
         <w:pStyle w:val="Compact"/>
       </w:pPr>
@@ -2225,7 +2296,7 @@
       <w:pPr>
         <w:numPr>
           <w:ilvl w:val="0"/>
-          <w:numId w:val="1009"/>
+          <w:numId w:val="1010"/>
         </w:numPr>
         <w:pStyle w:val="Compact"/>
       </w:pPr>
@@ -2249,7 +2320,7 @@
       <w:pPr>
         <w:numPr>
           <w:ilvl w:val="0"/>
-          <w:numId w:val="1009"/>
+          <w:numId w:val="1010"/>
         </w:numPr>
         <w:pStyle w:val="Compact"/>
       </w:pPr>
@@ -2261,7 +2332,7 @@
       <w:pPr>
         <w:numPr>
           <w:ilvl w:val="0"/>
-          <w:numId w:val="1009"/>
+          <w:numId w:val="1010"/>
         </w:numPr>
         <w:pStyle w:val="Compact"/>
       </w:pPr>
@@ -2290,7 +2361,7 @@
       <w:pPr>
         <w:numPr>
           <w:ilvl w:val="0"/>
-          <w:numId w:val="1010"/>
+          <w:numId w:val="1011"/>
         </w:numPr>
         <w:pStyle w:val="Compact"/>
       </w:pPr>
@@ -2319,19 +2390,19 @@
       <w:pPr>
         <w:numPr>
           <w:ilvl w:val="0"/>
-          <w:numId w:val="1011"/>
-        </w:numPr>
-        <w:pStyle w:val="Compact"/>
-      </w:pPr>
-      <w:r>
-        <w:t xml:space="preserve">Arahkan subdomain ke aplikasi.</w:t>
-      </w:r>
-    </w:p>
-    <w:p>
-      <w:pPr>
-        <w:numPr>
-          <w:ilvl w:val="0"/>
-          <w:numId w:val="1011"/>
+          <w:numId w:val="1012"/>
+        </w:numPr>
+        <w:pStyle w:val="Compact"/>
+      </w:pPr>
+      <w:r>
+        <w:t xml:space="preserve">Arahkan subdomain kamu ke aplikasi.</w:t>
+      </w:r>
+    </w:p>
+    <w:p>
+      <w:pPr>
+        <w:numPr>
+          <w:ilvl w:val="0"/>
+          <w:numId w:val="1012"/>
         </w:numPr>
         <w:pStyle w:val="Compact"/>
       </w:pPr>
@@ -2343,31 +2414,31 @@
       <w:pPr>
         <w:numPr>
           <w:ilvl w:val="0"/>
-          <w:numId w:val="1011"/>
-        </w:numPr>
-        <w:pStyle w:val="Compact"/>
-      </w:pPr>
-      <w:r>
-        <w:t xml:space="preserve">Buat admin awal.</w:t>
-      </w:r>
-    </w:p>
-    <w:p>
-      <w:pPr>
-        <w:numPr>
-          <w:ilvl w:val="0"/>
-          <w:numId w:val="1011"/>
-        </w:numPr>
-        <w:pStyle w:val="Compact"/>
-      </w:pPr>
-      <w:r>
-        <w:t xml:space="preserve">Tambahkan unique ID.</w:t>
-      </w:r>
-    </w:p>
-    <w:p>
-      <w:pPr>
-        <w:numPr>
-          <w:ilvl w:val="0"/>
-          <w:numId w:val="1011"/>
+          <w:numId w:val="1012"/>
+        </w:numPr>
+        <w:pStyle w:val="Compact"/>
+      </w:pPr>
+      <w:r>
+        <w:t xml:space="preserve">Buat admin pertama.</w:t>
+      </w:r>
+    </w:p>
+    <w:p>
+      <w:pPr>
+        <w:numPr>
+          <w:ilvl w:val="0"/>
+          <w:numId w:val="1012"/>
+        </w:numPr>
+        <w:pStyle w:val="Compact"/>
+      </w:pPr>
+      <w:r>
+        <w:t xml:space="preserve">Tambahkan unique ID dari admin panel.</w:t>
+      </w:r>
+    </w:p>
+    <w:p>
+      <w:pPr>
+        <w:numPr>
+          <w:ilvl w:val="0"/>
+          <w:numId w:val="1012"/>
         </w:numPr>
         <w:pStyle w:val="Compact"/>
       </w:pPr>
@@ -2380,7 +2451,7 @@
         <w:pStyle w:val="FirstParagraph"/>
       </w:pPr>
       <w:r>
-        <w:t xml:space="preserve">Jika memakai Vercel, client cukup import repository GitHub, isi Environment Variables, lalu deploy.</w:t>
+        <w:t xml:space="preserve">Jika kamu memakai Vercel, kamu bisa import repository GitHub, isi Environment Variables, lalu deploy.</w:t>
       </w:r>
     </w:p>
     <w:bookmarkEnd w:id="30"/>
@@ -2398,22 +2469,22 @@
         <w:pStyle w:val="FirstParagraph"/>
       </w:pPr>
       <w:r>
-        <w:t xml:space="preserve">Sebelum dibuka untuk user, cek:</w:t>
-      </w:r>
-    </w:p>
-    <w:p>
-      <w:pPr>
-        <w:numPr>
-          <w:ilvl w:val="0"/>
-          <w:numId w:val="1012"/>
-        </w:numPr>
-        <w:pStyle w:val="Compact"/>
-      </w:pPr>
-      <w:r>
-        <w:rPr>
-          <w:rStyle w:val="VerbatimChar"/>
-        </w:rPr>
-        <w:t xml:space="preserve">https://topup.clientdomain.com/register</w:t>
+        <w:t xml:space="preserve">Sebelum aplikasi dibuka untuk user, cek:</w:t>
+      </w:r>
+    </w:p>
+    <w:p>
+      <w:pPr>
+        <w:numPr>
+          <w:ilvl w:val="0"/>
+          <w:numId w:val="1013"/>
+        </w:numPr>
+        <w:pStyle w:val="Compact"/>
+      </w:pPr>
+      <w:r>
+        <w:rPr>
+          <w:rStyle w:val="VerbatimChar"/>
+        </w:rPr>
+        <w:t xml:space="preserve">https://topup.domainkamu.com/register</w:t>
       </w:r>
       <w:r>
         <w:t xml:space="preserve"> </w:t>
@@ -2426,15 +2497,15 @@
       <w:pPr>
         <w:numPr>
           <w:ilvl w:val="0"/>
-          <w:numId w:val="1012"/>
-        </w:numPr>
-        <w:pStyle w:val="Compact"/>
-      </w:pPr>
-      <w:r>
-        <w:rPr>
-          <w:rStyle w:val="VerbatimChar"/>
-        </w:rPr>
-        <w:t xml:space="preserve">https://topup.clientdomain.com/login</w:t>
+          <w:numId w:val="1013"/>
+        </w:numPr>
+        <w:pStyle w:val="Compact"/>
+      </w:pPr>
+      <w:r>
+        <w:rPr>
+          <w:rStyle w:val="VerbatimChar"/>
+        </w:rPr>
+        <w:t xml:space="preserve">https://topup.domainkamu.com/login</w:t>
       </w:r>
       <w:r>
         <w:t xml:space="preserve"> </w:t>
@@ -2447,15 +2518,15 @@
       <w:pPr>
         <w:numPr>
           <w:ilvl w:val="0"/>
-          <w:numId w:val="1012"/>
-        </w:numPr>
-        <w:pStyle w:val="Compact"/>
-      </w:pPr>
-      <w:r>
-        <w:rPr>
-          <w:rStyle w:val="VerbatimChar"/>
-        </w:rPr>
-        <w:t xml:space="preserve">https://topup.clientdomain.com/admin/login</w:t>
+          <w:numId w:val="1013"/>
+        </w:numPr>
+        <w:pStyle w:val="Compact"/>
+      </w:pPr>
+      <w:r>
+        <w:rPr>
+          <w:rStyle w:val="VerbatimChar"/>
+        </w:rPr>
+        <w:t xml:space="preserve">https://topup.domainkamu.com/admin/login</w:t>
       </w:r>
       <w:r>
         <w:t xml:space="preserve"> </w:t>
@@ -2468,7 +2539,7 @@
       <w:pPr>
         <w:numPr>
           <w:ilvl w:val="0"/>
-          <w:numId w:val="1012"/>
+          <w:numId w:val="1013"/>
         </w:numPr>
         <w:pStyle w:val="Compact"/>
       </w:pPr>
@@ -2480,7 +2551,7 @@
       <w:pPr>
         <w:numPr>
           <w:ilvl w:val="0"/>
-          <w:numId w:val="1012"/>
+          <w:numId w:val="1013"/>
         </w:numPr>
         <w:pStyle w:val="Compact"/>
       </w:pPr>
@@ -2492,7 +2563,7 @@
       <w:pPr>
         <w:numPr>
           <w:ilvl w:val="0"/>
-          <w:numId w:val="1012"/>
+          <w:numId w:val="1013"/>
         </w:numPr>
         <w:pStyle w:val="Compact"/>
       </w:pPr>
@@ -2504,7 +2575,7 @@
       <w:pPr>
         <w:numPr>
           <w:ilvl w:val="0"/>
-          <w:numId w:val="1012"/>
+          <w:numId w:val="1013"/>
         </w:numPr>
         <w:pStyle w:val="Compact"/>
       </w:pPr>
@@ -2516,7 +2587,7 @@
       <w:pPr>
         <w:numPr>
           <w:ilvl w:val="0"/>
-          <w:numId w:val="1012"/>
+          <w:numId w:val="1013"/>
         </w:numPr>
         <w:pStyle w:val="Compact"/>
       </w:pPr>
@@ -2528,7 +2599,7 @@
       <w:pPr>
         <w:numPr>
           <w:ilvl w:val="0"/>
-          <w:numId w:val="1012"/>
+          <w:numId w:val="1013"/>
         </w:numPr>
         <w:pStyle w:val="Compact"/>
       </w:pPr>
@@ -2540,7 +2611,7 @@
       <w:pPr>
         <w:numPr>
           <w:ilvl w:val="0"/>
-          <w:numId w:val="1012"/>
+          <w:numId w:val="1013"/>
         </w:numPr>
         <w:pStyle w:val="Compact"/>
       </w:pPr>
@@ -2552,7 +2623,7 @@
       <w:pPr>
         <w:numPr>
           <w:ilvl w:val="0"/>
-          <w:numId w:val="1012"/>
+          <w:numId w:val="1013"/>
         </w:numPr>
         <w:pStyle w:val="Compact"/>
       </w:pPr>
@@ -2579,7 +2650,7 @@
       <w:pPr>
         <w:numPr>
           <w:ilvl w:val="1"/>
-          <w:numId w:val="1013"/>
+          <w:numId w:val="1014"/>
         </w:numPr>
         <w:pStyle w:val="Compact"/>
       </w:pPr>
@@ -2600,7 +2671,7 @@
       <w:pPr>
         <w:numPr>
           <w:ilvl w:val="1"/>
-          <w:numId w:val="1013"/>
+          <w:numId w:val="1014"/>
         </w:numPr>
         <w:pStyle w:val="Compact"/>
       </w:pPr>
@@ -2621,7 +2692,7 @@
       <w:pPr>
         <w:numPr>
           <w:ilvl w:val="1"/>
-          <w:numId w:val="1013"/>
+          <w:numId w:val="1014"/>
         </w:numPr>
         <w:pStyle w:val="Compact"/>
       </w:pPr>
@@ -2660,7 +2731,7 @@
       <w:pPr>
         <w:numPr>
           <w:ilvl w:val="0"/>
-          <w:numId w:val="1014"/>
+          <w:numId w:val="1015"/>
         </w:numPr>
         <w:pStyle w:val="Compact"/>
       </w:pPr>
@@ -2732,19 +2803,19 @@
       <w:pPr>
         <w:numPr>
           <w:ilvl w:val="0"/>
-          <w:numId w:val="1014"/>
-        </w:numPr>
-        <w:pStyle w:val="Compact"/>
-      </w:pPr>
-      <w:r>
-        <w:t xml:space="preserve">Pastikan database bisa diakses dari hosting aplikasi.</w:t>
-      </w:r>
-    </w:p>
-    <w:p>
-      <w:pPr>
-        <w:numPr>
-          <w:ilvl w:val="0"/>
-          <w:numId w:val="1014"/>
+          <w:numId w:val="1015"/>
+        </w:numPr>
+        <w:pStyle w:val="Compact"/>
+      </w:pPr>
+      <w:r>
+        <w:t xml:space="preserve">Pastikan database kamu bisa diakses dari hosting aplikasi.</w:t>
+      </w:r>
+    </w:p>
+    <w:p>
+      <w:pPr>
+        <w:numPr>
+          <w:ilvl w:val="0"/>
+          <w:numId w:val="1015"/>
         </w:numPr>
         <w:pStyle w:val="Compact"/>
       </w:pPr>
@@ -2779,12 +2850,12 @@
       <w:pPr>
         <w:numPr>
           <w:ilvl w:val="0"/>
-          <w:numId w:val="1015"/>
-        </w:numPr>
-        <w:pStyle w:val="Compact"/>
-      </w:pPr>
-      <w:r>
-        <w:t xml:space="preserve">Pastikan admin sudah menambahkan</w:t>
+          <w:numId w:val="1016"/>
+        </w:numPr>
+        <w:pStyle w:val="Compact"/>
+      </w:pPr>
+      <w:r>
+        <w:t xml:space="preserve">Pastikan kamu sudah menambahkan</w:t>
       </w:r>
       <w:r>
         <w:t xml:space="preserve"> </w:t>
@@ -2803,7 +2874,7 @@
       <w:pPr>
         <w:numPr>
           <w:ilvl w:val="0"/>
-          <w:numId w:val="1015"/>
+          <w:numId w:val="1016"/>
         </w:numPr>
         <w:pStyle w:val="Compact"/>
       </w:pPr>
@@ -2823,7 +2894,7 @@
       <w:pPr>
         <w:numPr>
           <w:ilvl w:val="0"/>
-          <w:numId w:val="1016"/>
+          <w:numId w:val="1017"/>
         </w:numPr>
         <w:pStyle w:val="Compact"/>
       </w:pPr>
@@ -2847,7 +2918,7 @@
       <w:pPr>
         <w:numPr>
           <w:ilvl w:val="0"/>
-          <w:numId w:val="1016"/>
+          <w:numId w:val="1017"/>
         </w:numPr>
         <w:pStyle w:val="Compact"/>
       </w:pPr>
@@ -2871,7 +2942,7 @@
       <w:pPr>
         <w:numPr>
           <w:ilvl w:val="0"/>
-          <w:numId w:val="1016"/>
+          <w:numId w:val="1017"/>
         </w:numPr>
         <w:pStyle w:val="Compact"/>
       </w:pPr>
@@ -2895,7 +2966,7 @@
       <w:pPr>
         <w:numPr>
           <w:ilvl w:val="0"/>
-          <w:numId w:val="1016"/>
+          <w:numId w:val="1017"/>
         </w:numPr>
         <w:pStyle w:val="Compact"/>
       </w:pPr>
@@ -2915,19 +2986,19 @@
       <w:pPr>
         <w:numPr>
           <w:ilvl w:val="0"/>
-          <w:numId w:val="1017"/>
-        </w:numPr>
-        <w:pStyle w:val="Compact"/>
-      </w:pPr>
-      <w:r>
-        <w:t xml:space="preserve">Pastikan callback URL di Hilogate memakai subdomain production.</w:t>
-      </w:r>
-    </w:p>
-    <w:p>
-      <w:pPr>
-        <w:numPr>
-          <w:ilvl w:val="0"/>
-          <w:numId w:val="1017"/>
+          <w:numId w:val="1018"/>
+        </w:numPr>
+        <w:pStyle w:val="Compact"/>
+      </w:pPr>
+      <w:r>
+        <w:t xml:space="preserve">Pastikan callback URL di Hilogate memakai subdomain production kamu.</w:t>
+      </w:r>
+    </w:p>
+    <w:p>
+      <w:pPr>
+        <w:numPr>
+          <w:ilvl w:val="0"/>
+          <w:numId w:val="1018"/>
         </w:numPr>
         <w:pStyle w:val="Compact"/>
       </w:pPr>
@@ -2939,7 +3010,7 @@
       <w:pPr>
         <w:numPr>
           <w:ilvl w:val="0"/>
-          <w:numId w:val="1017"/>
+          <w:numId w:val="1018"/>
         </w:numPr>
         <w:pStyle w:val="Compact"/>
       </w:pPr>
@@ -2963,7 +3034,7 @@
       <w:pPr>
         <w:numPr>
           <w:ilvl w:val="0"/>
-          <w:numId w:val="1017"/>
+          <w:numId w:val="1018"/>
         </w:numPr>
         <w:pStyle w:val="Compact"/>
       </w:pPr>
@@ -2972,13 +3043,13 @@
       </w:r>
     </w:p>
     <w:bookmarkEnd w:id="32"/>
-    <w:bookmarkStart w:id="33" w:name="form-data-dari-client"/>
+    <w:bookmarkStart w:id="33" w:name="data-yang-perlu-kamu-isi"/>
     <w:p>
       <w:pPr>
         <w:pStyle w:val="Heading2"/>
       </w:pPr>
       <w:r>
-        <w:t xml:space="preserve">14. Form Data dari Client</w:t>
+        <w:t xml:space="preserve">14. Data yang Perlu Kamu Isi</w:t>
       </w:r>
     </w:p>
     <w:p>
@@ -2986,7 +3057,7 @@
         <w:pStyle w:val="FirstParagraph"/>
       </w:pPr>
       <w:r>
-        <w:t xml:space="preserve">Client perlu mengisi data berikut:</w:t>
+        <w:t xml:space="preserve">Isi tabel ini sebelum deployment:</w:t>
       </w:r>
     </w:p>
     <w:tbl>
@@ -3018,7 +3089,7 @@
               <w:jc w:val="left"/>
             </w:pPr>
             <w:r>
-              <w:t xml:space="preserve">Isi Client</w:t>
+              <w:t xml:space="preserve">Isi Kamu</w:t>
             </w:r>
           </w:p>
         </w:tc>
@@ -3159,7 +3230,7 @@
               <w:jc w:val="left"/>
             </w:pPr>
             <w:r>
-              <w:t xml:space="preserve">Email admin awal</w:t>
+              <w:t xml:space="preserve">Email admin pertama</w:t>
             </w:r>
           </w:p>
         </w:tc>
@@ -3175,7 +3246,7 @@
               <w:jc w:val="left"/>
             </w:pPr>
             <w:r>
-              <w:t xml:space="preserve">Password admin awal</w:t>
+              <w:t xml:space="preserve">Password admin pertama</w:t>
             </w:r>
           </w:p>
         </w:tc>
@@ -3205,7 +3276,7 @@
               <w:rPr>
                 <w:rStyle w:val="VerbatimChar"/>
               </w:rPr>
-              <w:t xml:space="preserve">https://topup.clientdomain.com/api/callbacks/hilogate/transaction</w:t>
+              <w:t xml:space="preserve">https://topup.domainkamu.com/api/callbacks/hilogate/transaction</w:t>
             </w:r>
           </w:p>
         </w:tc>
@@ -3232,7 +3303,7 @@
               <w:rPr>
                 <w:rStyle w:val="VerbatimChar"/>
               </w:rPr>
-              <w:t xml:space="preserve">https://topup.clientdomain.com/api/callbacks/hilogate/withdrawal</w:t>
+              <w:t xml:space="preserve">https://topup.domainkamu.com/api/callbacks/hilogate/withdrawal</w:t>
             </w:r>
           </w:p>
         </w:tc>
@@ -3252,7 +3323,7 @@
       <w:pPr>
         <w:numPr>
           <w:ilvl w:val="0"/>
-          <w:numId w:val="1018"/>
+          <w:numId w:val="1019"/>
         </w:numPr>
         <w:pStyle w:val="Compact"/>
       </w:pPr>
@@ -3279,7 +3350,7 @@
       <w:pPr>
         <w:numPr>
           <w:ilvl w:val="0"/>
-          <w:numId w:val="1018"/>
+          <w:numId w:val="1019"/>
         </w:numPr>
         <w:pStyle w:val="Compact"/>
       </w:pPr>
@@ -3291,7 +3362,7 @@
       <w:pPr>
         <w:numPr>
           <w:ilvl w:val="0"/>
-          <w:numId w:val="1018"/>
+          <w:numId w:val="1019"/>
         </w:numPr>
         <w:pStyle w:val="Compact"/>
       </w:pPr>
@@ -3303,7 +3374,7 @@
       <w:pPr>
         <w:numPr>
           <w:ilvl w:val="0"/>
-          <w:numId w:val="1018"/>
+          <w:numId w:val="1019"/>
         </w:numPr>
         <w:pStyle w:val="Compact"/>
       </w:pPr>
@@ -3315,7 +3386,7 @@
       <w:pPr>
         <w:numPr>
           <w:ilvl w:val="0"/>
-          <w:numId w:val="1018"/>
+          <w:numId w:val="1019"/>
         </w:numPr>
         <w:pStyle w:val="Compact"/>
       </w:pPr>
@@ -3948,34 +4019,7 @@
     <w:abstractNumId w:val="991"/>
   </w:num>
   <w:num w:numId="1005">
-    <w:abstractNumId w:val="99411"/>
-    <w:lvlOverride w:ilvl="0">
-      <w:startOverride w:val="1"/>
-    </w:lvlOverride>
-    <w:lvlOverride w:ilvl="1">
-      <w:startOverride w:val="1"/>
-    </w:lvlOverride>
-    <w:lvlOverride w:ilvl="2">
-      <w:startOverride w:val="1"/>
-    </w:lvlOverride>
-    <w:lvlOverride w:ilvl="3">
-      <w:startOverride w:val="1"/>
-    </w:lvlOverride>
-    <w:lvlOverride w:ilvl="4">
-      <w:startOverride w:val="1"/>
-    </w:lvlOverride>
-    <w:lvlOverride w:ilvl="5">
-      <w:startOverride w:val="1"/>
-    </w:lvlOverride>
-    <w:lvlOverride w:ilvl="6">
-      <w:startOverride w:val="1"/>
-    </w:lvlOverride>
-    <w:lvlOverride w:ilvl="7">
-      <w:startOverride w:val="1"/>
-    </w:lvlOverride>
-    <w:lvlOverride w:ilvl="8">
-      <w:startOverride w:val="1"/>
-    </w:lvlOverride>
+    <w:abstractNumId w:val="991"/>
   </w:num>
   <w:num w:numId="1006">
     <w:abstractNumId w:val="99411"/>
@@ -4038,6 +4082,36 @@
     </w:lvlOverride>
   </w:num>
   <w:num w:numId="1008">
+    <w:abstractNumId w:val="99411"/>
+    <w:lvlOverride w:ilvl="0">
+      <w:startOverride w:val="1"/>
+    </w:lvlOverride>
+    <w:lvlOverride w:ilvl="1">
+      <w:startOverride w:val="1"/>
+    </w:lvlOverride>
+    <w:lvlOverride w:ilvl="2">
+      <w:startOverride w:val="1"/>
+    </w:lvlOverride>
+    <w:lvlOverride w:ilvl="3">
+      <w:startOverride w:val="1"/>
+    </w:lvlOverride>
+    <w:lvlOverride w:ilvl="4">
+      <w:startOverride w:val="1"/>
+    </w:lvlOverride>
+    <w:lvlOverride w:ilvl="5">
+      <w:startOverride w:val="1"/>
+    </w:lvlOverride>
+    <w:lvlOverride w:ilvl="6">
+      <w:startOverride w:val="1"/>
+    </w:lvlOverride>
+    <w:lvlOverride w:ilvl="7">
+      <w:startOverride w:val="1"/>
+    </w:lvlOverride>
+    <w:lvlOverride w:ilvl="8">
+      <w:startOverride w:val="1"/>
+    </w:lvlOverride>
+  </w:num>
+  <w:num w:numId="1009">
     <w:abstractNumId w:val="99412"/>
     <w:lvlOverride w:ilvl="0">
       <w:startOverride w:val="2"/>
@@ -4067,7 +4141,7 @@
       <w:startOverride w:val="2"/>
     </w:lvlOverride>
   </w:num>
-  <w:num w:numId="1009">
+  <w:num w:numId="1010">
     <w:abstractNumId w:val="99413"/>
     <w:lvlOverride w:ilvl="0">
       <w:startOverride w:val="3"/>
@@ -4097,7 +4171,7 @@
       <w:startOverride w:val="3"/>
     </w:lvlOverride>
   </w:num>
-  <w:num w:numId="1010">
+  <w:num w:numId="1011">
     <w:abstractNumId w:val="99416"/>
     <w:lvlOverride w:ilvl="0">
       <w:startOverride w:val="6"/>
@@ -4127,7 +4201,7 @@
       <w:startOverride w:val="6"/>
     </w:lvlOverride>
   </w:num>
-  <w:num w:numId="1011">
+  <w:num w:numId="1012">
     <w:abstractNumId w:val="99417"/>
     <w:lvlOverride w:ilvl="0">
       <w:startOverride w:val="7"/>
@@ -4156,9 +4230,6 @@
     <w:lvlOverride w:ilvl="8">
       <w:startOverride w:val="7"/>
     </w:lvlOverride>
-  </w:num>
-  <w:num w:numId="1012">
-    <w:abstractNumId w:val="991"/>
   </w:num>
   <w:num w:numId="1013">
     <w:abstractNumId w:val="991"/>
@@ -4176,6 +4247,9 @@
     <w:abstractNumId w:val="991"/>
   </w:num>
   <w:num w:numId="1018">
+    <w:abstractNumId w:val="991"/>
+  </w:num>
+  <w:num w:numId="1019">
     <w:abstractNumId w:val="991"/>
   </w:num>
 </w:numbering>

</xml_diff>